<commit_message>
cleanup: delete 170+ stale files — templates, drafts, duplicates, quest
</commit_message>
<xml_diff>
--- a/career/resume/Senior-L&D_BY_ATS.docx
+++ b/career/resume/Senior-L&D_BY_ATS.docx
@@ -4,759 +4,773 @@
   <w:body>
     <w:p>
       <w:pPr>
-        <w:spacing w:before="0" w:after="40"/>
+        <w:spacing w:after="80"/>
+        <w:jc w:val="center"/>
       </w:pPr>
       <w:r>
         <w:rPr>
           <w:b/>
-          <w:sz w:val="28"/>
+          <w:i w:val="0"/>
+          <w:color w:val="1F3A5F"/>
+          <w:sz w:val="36"/>
         </w:rPr>
         <w:t>Марценюк Наталья</w:t>
       </w:r>
     </w:p>
     <w:p>
       <w:pPr>
-        <w:spacing w:before="0" w:after="40"/>
+        <w:spacing w:after="80"/>
+        <w:jc w:val="center"/>
       </w:pPr>
       <w:r>
         <w:rPr>
           <w:b w:val="0"/>
-          <w:sz w:val="21"/>
+          <w:i w:val="0"/>
+          <w:sz w:val="20"/>
         </w:rPr>
-        <w:t>+7 (903) 973-98-30  |  @mrk_natalia  |  look85@gmail.com</w:t>
+        <w:t>Telegram: @mrk_natalia • Email: look85@gmail.com • GitHub: github.com/look85-ops (AOS Analyzer) • Moscow → Minsk (relocating Q4 2026)</w:t>
       </w:r>
     </w:p>
     <w:p>
       <w:pPr>
-        <w:spacing w:before="0" w:after="40"/>
+        <w:spacing w:before="240" w:after="80"/>
+        <w:pBdr>
+          <w:bottom w:val="single" w:sz="4" w:space="1" w:color="1F3A5F"/>
+        </w:pBdr>
+      </w:pPr>
+      <w:r>
+        <w:rPr>
+          <w:b/>
+          <w:i w:val="0"/>
+          <w:color w:val="1F3A5F"/>
+          <w:sz w:val="24"/>
+        </w:rPr>
+        <w:t>Professional Summary</w:t>
+      </w:r>
+    </w:p>
+    <w:p>
+      <w:pPr>
+        <w:spacing w:after="40"/>
+      </w:pPr>
+      <w:r>
+        <w:rPr>
+          <w:b/>
+          <w:i w:val="0"/>
+          <w:sz w:val="20"/>
+        </w:rPr>
+        <w:t>Senior L&amp;D professional with 10+ years in corporate education, sales enablement, and learning design. Combines instructional design, marketing enablement, and AI to deliver measurable business outcomes:</w:t>
+      </w:r>
+      <w:r>
+        <w:rPr>
+          <w:b w:val="0"/>
+          <w:i w:val="0"/>
+          <w:sz w:val="20"/>
+        </w:rPr>
+        <w:t xml:space="preserve"> improved win rates, reduced time-to-productivity, higher NPS. Data-informed approach: hypothesis → MVP → iterations → metrics. Built AI-powered feedback analytics for corporate education — automated survey processing and unique data-fabrication detection. Experience building competency matrices, role-based learning tracks, onboarding programs, and Customer Education from scratch across industries (railway, telecom, banking, EdTech).</w:t>
+      </w:r>
+    </w:p>
+    <w:p>
+      <w:pPr>
+        <w:spacing w:before="240" w:after="80"/>
+        <w:pBdr>
+          <w:bottom w:val="single" w:sz="4" w:space="1" w:color="1F3A5F"/>
+        </w:pBdr>
+      </w:pPr>
+      <w:r>
+        <w:rPr>
+          <w:b/>
+          <w:i w:val="0"/>
+          <w:color w:val="1F3A5F"/>
+          <w:sz w:val="24"/>
+        </w:rPr>
+        <w:t>Core Competencies</w:t>
+      </w:r>
+    </w:p>
+    <w:p>
+      <w:pPr>
+        <w:spacing w:after="40"/>
+      </w:pPr>
+      <w:r>
+        <w:rPr>
+          <w:b/>
+          <w:i w:val="0"/>
+          <w:sz w:val="20"/>
+        </w:rPr>
+        <w:t>Enablement &amp; Onboarding:</w:t>
+      </w:r>
+      <w:r>
+        <w:rPr>
+          <w:b w:val="0"/>
+          <w:i w:val="0"/>
+          <w:sz w:val="20"/>
+        </w:rPr>
+        <w:t xml:space="preserve"> Sales Enablement, Marketing Enablement, Onboarding, Customer Education, Playbooks/Job Aids, Time-to-Productivity, Adoption, Win Rate</w:t>
+      </w:r>
+    </w:p>
+    <w:p>
+      <w:pPr>
+        <w:spacing w:after="40"/>
+      </w:pPr>
+      <w:r>
+        <w:rPr>
+          <w:b/>
+          <w:i w:val="0"/>
+          <w:sz w:val="20"/>
+        </w:rPr>
+        <w:t>Instructional Design:</w:t>
+      </w:r>
+      <w:r>
+        <w:rPr>
+          <w:b w:val="0"/>
+          <w:i w:val="0"/>
+          <w:sz w:val="20"/>
+        </w:rPr>
+        <w:t xml:space="preserve"> Instructional Design, Microlearning, Content Strategy, Blended Learning, E-learning, Continuing Education Programs, Training of Trainers (ToT)</w:t>
+      </w:r>
+    </w:p>
+    <w:p>
+      <w:pPr>
+        <w:spacing w:after="40"/>
+      </w:pPr>
+      <w:r>
+        <w:rPr>
+          <w:b/>
+          <w:i w:val="0"/>
+          <w:sz w:val="20"/>
+        </w:rPr>
+        <w:t>Learning Analytics &amp; Assessment:</w:t>
+      </w:r>
+      <w:r>
+        <w:rPr>
+          <w:b w:val="0"/>
+          <w:i w:val="0"/>
+          <w:sz w:val="20"/>
+        </w:rPr>
+        <w:t xml:space="preserve"> Learning Analytics, Competency Matrix, Skills Gap Analysis, Role-based Learning Tracks, Kirkpatrick/Phillips Evaluation, NPS, Cohort Analysis (30/60/90)</w:t>
+      </w:r>
+    </w:p>
+    <w:p>
+      <w:pPr>
+        <w:spacing w:after="40"/>
+      </w:pPr>
+      <w:r>
+        <w:rPr>
+          <w:b/>
+          <w:i w:val="0"/>
+          <w:sz w:val="20"/>
+        </w:rPr>
+        <w:t>LMS &amp; Learning Operations:</w:t>
+      </w:r>
+      <w:r>
+        <w:rPr>
+          <w:b w:val="0"/>
+          <w:i w:val="0"/>
+          <w:sz w:val="20"/>
+        </w:rPr>
+        <w:t xml:space="preserve"> LMS Administration Oversight (content upload, progress tracking, adoption analytics, team coordination), Content QA</w:t>
+      </w:r>
+    </w:p>
+    <w:p>
+      <w:pPr>
+        <w:spacing w:after="40"/>
+      </w:pPr>
+      <w:r>
+        <w:rPr>
+          <w:b/>
+          <w:i w:val="0"/>
+          <w:sz w:val="20"/>
+        </w:rPr>
+        <w:t>AI &amp; Automation:</w:t>
+      </w:r>
+      <w:r>
+        <w:rPr>
+          <w:b w:val="0"/>
+          <w:i w:val="0"/>
+          <w:sz w:val="20"/>
+        </w:rPr>
+        <w:t xml:space="preserve"> GenAI for Content, Prompt Engineering, Workflow Automation, AI-powered Feedback Analytics (100+ surveys/cycle), Data-fabrication Detection, Data-informed Design</w:t>
+      </w:r>
+    </w:p>
+    <w:p>
+      <w:pPr>
+        <w:spacing w:after="40"/>
+      </w:pPr>
+      <w:r>
+        <w:rPr>
+          <w:b/>
+          <w:i w:val="0"/>
+          <w:sz w:val="20"/>
+        </w:rPr>
+        <w:t>Management:</w:t>
+      </w:r>
+      <w:r>
+        <w:rPr>
+          <w:b w:val="0"/>
+          <w:i w:val="0"/>
+          <w:sz w:val="20"/>
+        </w:rPr>
+        <w:t xml:space="preserve"> Stakeholder Management, Vendor Management, Team Leadership (4+ FTE), Learning Budget Planning</w:t>
+      </w:r>
+    </w:p>
+    <w:p>
+      <w:pPr>
+        <w:spacing w:after="40"/>
+      </w:pPr>
+      <w:r>
+        <w:rPr>
+          <w:b/>
+          <w:i w:val="0"/>
+          <w:sz w:val="20"/>
+        </w:rPr>
+        <w:t>Tools:</w:t>
+      </w:r>
+      <w:r>
+        <w:rPr>
+          <w:b w:val="0"/>
+          <w:i w:val="0"/>
+          <w:sz w:val="20"/>
+        </w:rPr>
+        <w:t xml:space="preserve"> Notion, Miro, Tilda, Canva, Loom, Google Workspace, Course Editor</w:t>
+      </w:r>
+    </w:p>
+    <w:p>
+      <w:pPr>
+        <w:spacing w:before="240" w:after="80"/>
+        <w:pBdr>
+          <w:bottom w:val="single" w:sz="4" w:space="1" w:color="1F3A5F"/>
+        </w:pBdr>
+      </w:pPr>
+      <w:r>
+        <w:rPr>
+          <w:b/>
+          <w:i w:val="0"/>
+          <w:color w:val="1F3A5F"/>
+          <w:sz w:val="24"/>
+        </w:rPr>
+        <w:t>Professional Experience</w:t>
+      </w:r>
+    </w:p>
+    <w:p>
+      <w:pPr>
+        <w:spacing w:after="40"/>
+      </w:pPr>
+      <w:r>
+        <w:rPr>
+          <w:b/>
+          <w:i w:val="0"/>
+          <w:sz w:val="20"/>
+        </w:rPr>
+        <w:t>Lead Learning Designer / Educational Project Manager</w:t>
+      </w:r>
+      <w:r>
+        <w:rPr>
+          <w:b w:val="0"/>
+          <w:i w:val="0"/>
+          <w:sz w:val="20"/>
+        </w:rPr>
+        <w:t xml:space="preserve"> — Russian Railways (RZD) Corporate University (2024–Present)</w:t>
+      </w:r>
+    </w:p>
+    <w:p>
+      <w:pPr>
+        <w:pStyle w:val="ListBullet"/>
+        <w:spacing w:after="40"/>
+      </w:pPr>
+      <w:r>
+        <w:rPr>
+          <w:b/>
+          <w:i w:val="0"/>
+          <w:sz w:val="20"/>
+        </w:rPr>
+        <w:t>Architected leadership development program for 50+ regional railway units:</w:t>
+      </w:r>
+      <w:r>
+        <w:rPr>
+          <w:b w:val="0"/>
+          <w:i w:val="0"/>
+          <w:sz w:val="20"/>
+        </w:rPr>
+        <w:t xml:space="preserve"> competency matrix, microlearning, blended learning (in-person, e-learning, field trips), ToT.</w:t>
+      </w:r>
+    </w:p>
+    <w:p>
+      <w:pPr>
+        <w:pStyle w:val="ListBullet"/>
+        <w:spacing w:after="40"/>
+      </w:pPr>
+      <w:r>
+        <w:rPr>
+          <w:b/>
+          <w:i w:val="0"/>
+          <w:sz w:val="20"/>
+        </w:rPr>
+        <w:t>Managed full program cycle:</w:t>
+      </w:r>
+      <w:r>
+        <w:rPr>
+          <w:b w:val="0"/>
+          <w:i w:val="0"/>
+          <w:sz w:val="20"/>
+        </w:rPr>
+        <w:t xml:space="preserve"> stakeholder discovery, content design, instructor enablement, LMS operations oversight (content upload, progress tracking, adoption analytics), QA, evaluation.</w:t>
+      </w:r>
+    </w:p>
+    <w:p>
+      <w:pPr>
+        <w:pStyle w:val="ListBullet"/>
+        <w:spacing w:after="40"/>
+      </w:pPr>
+      <w:r>
+        <w:rPr>
+          <w:b/>
+          <w:i w:val="0"/>
+          <w:sz w:val="20"/>
+        </w:rPr>
+        <w:t>Results:</w:t>
+      </w:r>
+      <w:r>
+        <w:rPr>
+          <w:b w:val="0"/>
+          <w:i w:val="0"/>
+          <w:sz w:val="20"/>
+        </w:rPr>
+        <w:t xml:space="preserve"> 400+ managers trained (2024–2025); NPS 9.7 (Mar 2026); Smart Pyramid Award 2024 for best educational product.</w:t>
+      </w:r>
+    </w:p>
+    <w:p>
+      <w:pPr>
+        <w:pStyle w:val="ListBullet"/>
+        <w:spacing w:after="40"/>
+      </w:pPr>
+      <w:r>
+        <w:rPr>
+          <w:b/>
+          <w:i w:val="0"/>
+          <w:sz w:val="20"/>
+        </w:rPr>
+        <w:t>Built AI-powered feedback analytics:</w:t>
+      </w:r>
+      <w:r>
+        <w:rPr>
+          <w:b w:val="0"/>
+          <w:i w:val="0"/>
+          <w:sz w:val="20"/>
+        </w:rPr>
+        <w:t xml:space="preserve"> automated processing of 100+ surveys per cycle, pattern detection, A/B tests, auto-generated reports (manual effort cut from 3 days to 2 hours); unique data-fabrication detection — anomalies in 6/7 institutions' data, no market analog.</w:t>
+      </w:r>
+    </w:p>
+    <w:p>
+      <w:pPr>
+        <w:pStyle w:val="ListBullet"/>
+        <w:spacing w:after="40"/>
       </w:pPr>
       <w:r>
         <w:rPr>
           <w:b w:val="0"/>
-          <w:sz w:val="21"/>
+          <w:i w:val="0"/>
+          <w:sz w:val="20"/>
         </w:rPr>
-        <w:t>Москва → Минск (релокация, осень 2026)</w:t>
+        <w:t>Published open-source AOS Analyzer on GitHub (github.com/look85-ops/aos-analyzer) — AI tool for feedback-quality auditing.</w:t>
       </w:r>
     </w:p>
     <w:p>
       <w:pPr>
-        <w:spacing w:before="0" w:after="40"/>
+        <w:pStyle w:val="ListBullet"/>
+        <w:spacing w:after="40"/>
       </w:pPr>
       <w:r>
         <w:rPr>
           <w:b w:val="0"/>
-          <w:sz w:val="21"/>
+          <w:i w:val="0"/>
+          <w:sz w:val="20"/>
         </w:rPr>
-        <w:t>Занятость: полная, проектная  |  График: гибкий, сокращённый рабочий день</w:t>
+        <w:t>Participated in learning budget planning and program reporting.</w:t>
       </w:r>
     </w:p>
     <w:p>
       <w:pPr>
-        <w:spacing w:before="0" w:after="40"/>
+        <w:spacing w:after="40"/>
+      </w:pPr>
+      <w:r>
+        <w:rPr>
+          <w:b/>
+          <w:i w:val="0"/>
+          <w:sz w:val="20"/>
+        </w:rPr>
+        <w:t>Educational Project Manager</w:t>
+      </w:r>
+      <w:r>
+        <w:rPr>
+          <w:b w:val="0"/>
+          <w:i w:val="0"/>
+          <w:sz w:val="20"/>
+        </w:rPr>
+        <w:t xml:space="preserve"> — Bauman Moscow State Technical University (2023–2024)</w:t>
+      </w:r>
+    </w:p>
+    <w:p>
+      <w:pPr>
+        <w:pStyle w:val="ListBullet"/>
+        <w:spacing w:after="40"/>
+      </w:pPr>
+      <w:r>
+        <w:rPr>
+          <w:b/>
+          <w:i w:val="0"/>
+          <w:sz w:val="20"/>
+        </w:rPr>
+        <w:t>Designed continuing education programs from scratch for external corporate clients:</w:t>
+      </w:r>
+      <w:r>
+        <w:rPr>
+          <w:b w:val="0"/>
+          <w:i w:val="0"/>
+          <w:sz w:val="20"/>
+        </w:rPr>
+        <w:t xml:space="preserve"> discovery, curriculum design, e-learning, in-person formats.</w:t>
+      </w:r>
+    </w:p>
+    <w:p>
+      <w:pPr>
+        <w:pStyle w:val="ListBullet"/>
+        <w:spacing w:after="40"/>
       </w:pPr>
       <w:r>
         <w:rPr>
           <w:b w:val="0"/>
-          <w:sz w:val="21"/>
+          <w:i w:val="0"/>
+          <w:sz w:val="20"/>
         </w:rPr>
+        <w:t>Introduced role-based learning tracks and instructor support (methodology, QA).</w:t>
       </w:r>
     </w:p>
     <w:p>
       <w:pPr>
-        <w:spacing w:before="0" w:after="40"/>
+        <w:pStyle w:val="ListBullet"/>
+        <w:spacing w:after="40"/>
+      </w:pPr>
+      <w:r>
+        <w:rPr>
+          <w:b w:val="0"/>
+          <w:i w:val="0"/>
+          <w:sz w:val="20"/>
+        </w:rPr>
+        <w:t>Managed LMS content upload and learning analytics reporting.</w:t>
+      </w:r>
+    </w:p>
+    <w:p>
+      <w:pPr>
+        <w:spacing w:after="40"/>
       </w:pPr>
       <w:r>
         <w:rPr>
           <w:b/>
-          <w:sz w:val="24"/>
+          <w:i w:val="0"/>
+          <w:sz w:val="20"/>
         </w:rPr>
-        <w:t>Желаемая должность</w:t>
+        <w:t>Learning Program Manager (SberBusiness)</w:t>
+      </w:r>
+      <w:r>
+        <w:rPr>
+          <w:b w:val="0"/>
+          <w:i w:val="0"/>
+          <w:sz w:val="20"/>
+        </w:rPr>
+        <w:t xml:space="preserve"> — Sber (2021)</w:t>
       </w:r>
     </w:p>
     <w:p>
       <w:pPr>
-        <w:spacing w:before="0" w:after="40"/>
+        <w:pStyle w:val="ListBullet"/>
+        <w:spacing w:after="40"/>
+      </w:pPr>
+      <w:r>
+        <w:rPr>
+          <w:b/>
+          <w:i w:val="0"/>
+          <w:sz w:val="20"/>
+        </w:rPr>
+        <w:t>Managed learning portfolio for 9,000+ commercial banking employees:</w:t>
+      </w:r>
+      <w:r>
+        <w:rPr>
+          <w:b w:val="0"/>
+          <w:i w:val="0"/>
+          <w:sz w:val="20"/>
+        </w:rPr>
+        <w:t xml:space="preserve"> needs diagnosis, solution architecture, vendor coordination, content QA.</w:t>
+      </w:r>
+    </w:p>
+    <w:p>
+      <w:pPr>
+        <w:pStyle w:val="ListBullet"/>
+        <w:spacing w:after="40"/>
+      </w:pPr>
+      <w:r>
+        <w:rPr>
+          <w:b/>
+          <w:i w:val="0"/>
+          <w:sz w:val="20"/>
+        </w:rPr>
+        <w:t>Led onboarding redesign:</w:t>
+      </w:r>
+      <w:r>
+        <w:rPr>
+          <w:b w:val="0"/>
+          <w:i w:val="0"/>
+          <w:sz w:val="20"/>
+        </w:rPr>
+        <w:t xml:space="preserve"> modular program + job aids, role-based tracks. Results: −30% time-to-productivity; 85% tool adoption (cohort analysis 30/60/90).</w:t>
+      </w:r>
+    </w:p>
+    <w:p>
+      <w:pPr>
+        <w:pStyle w:val="ListBullet"/>
+        <w:spacing w:after="40"/>
+      </w:pPr>
+      <w:r>
+        <w:rPr>
+          <w:b/>
+          <w:i w:val="0"/>
+          <w:sz w:val="20"/>
+        </w:rPr>
+        <w:t>Managed LMS operations:</w:t>
+      </w:r>
+      <w:r>
+        <w:rPr>
+          <w:b w:val="0"/>
+          <w:i w:val="0"/>
+          <w:sz w:val="20"/>
+        </w:rPr>
+        <w:t xml:space="preserve"> content deployment, adoption tracking, reporting.</w:t>
+      </w:r>
+    </w:p>
+    <w:p>
+      <w:pPr>
+        <w:pStyle w:val="ListBullet"/>
+        <w:spacing w:after="40"/>
       </w:pPr>
       <w:r>
         <w:rPr>
           <w:b w:val="0"/>
-          <w:sz w:val="21"/>
+          <w:i w:val="0"/>
+          <w:sz w:val="20"/>
         </w:rPr>
-        <w:t>Руководитель L&amp;D / Learning Product Manager / Enablement-менеджер / Training Manager / Senior L&amp;D</w:t>
+        <w:t>Led team of 4; managed external vendors and budget coordination.</w:t>
       </w:r>
     </w:p>
     <w:p>
       <w:pPr>
-        <w:spacing w:before="0" w:after="40"/>
+        <w:spacing w:after="40"/>
+      </w:pPr>
+      <w:r>
+        <w:rPr>
+          <w:b/>
+          <w:i w:val="0"/>
+          <w:sz w:val="20"/>
+        </w:rPr>
+        <w:t>Additional Experience:</w:t>
+      </w:r>
+      <w:r>
+        <w:rPr>
+          <w:b w:val="0"/>
+          <w:i w:val="0"/>
+          <w:sz w:val="20"/>
+        </w:rPr>
+        <w:t xml:space="preserve"> FRII (2021), Moscow Small Business Agency (2020–2021), CRMM (2020), MBS (2012–2014) — educational project management, program design, quality standards, budgeting.</w:t>
+      </w:r>
+    </w:p>
+    <w:p>
+      <w:pPr>
+        <w:spacing w:before="240" w:after="80"/>
+        <w:pBdr>
+          <w:bottom w:val="single" w:sz="4" w:space="1" w:color="1F3A5F"/>
+        </w:pBdr>
+      </w:pPr>
+      <w:r>
+        <w:rPr>
+          <w:b/>
+          <w:i w:val="0"/>
+          <w:color w:val="1F3A5F"/>
+          <w:sz w:val="24"/>
+        </w:rPr>
+        <w:t>Education &amp; Certifications</w:t>
+      </w:r>
+    </w:p>
+    <w:p>
+      <w:pPr>
+        <w:pStyle w:val="ListBullet"/>
+        <w:spacing w:after="40"/>
       </w:pPr>
       <w:r>
         <w:rPr>
           <w:b w:val="0"/>
-          <w:sz w:val="21"/>
+          <w:i w:val="0"/>
+          <w:sz w:val="20"/>
         </w:rPr>
+        <w:t>Psychology; Educational Psychology — Moscow City Pedagogical University (MCPU)</w:t>
       </w:r>
     </w:p>
     <w:p>
       <w:pPr>
-        <w:spacing w:before="0" w:after="40"/>
+        <w:pStyle w:val="ListBullet"/>
+        <w:spacing w:after="40"/>
+      </w:pPr>
+      <w:r>
+        <w:rPr>
+          <w:b w:val="0"/>
+          <w:i w:val="0"/>
+          <w:sz w:val="20"/>
+        </w:rPr>
+        <w:t>Learning Design Intensive — ITMO University (2023)</w:t>
+      </w:r>
+    </w:p>
+    <w:p>
+      <w:pPr>
+        <w:pStyle w:val="ListBullet"/>
+        <w:spacing w:after="40"/>
+      </w:pPr>
+      <w:r>
+        <w:rPr>
+          <w:b w:val="0"/>
+          <w:i w:val="0"/>
+          <w:sz w:val="20"/>
+        </w:rPr>
+        <w:t>Internal Marketing &amp; Communications — HSE University (2022)</w:t>
+      </w:r>
+    </w:p>
+    <w:p>
+      <w:pPr>
+        <w:pStyle w:val="ListBullet"/>
+        <w:spacing w:after="40"/>
+      </w:pPr>
+      <w:r>
+        <w:rPr>
+          <w:b w:val="0"/>
+          <w:i w:val="0"/>
+          <w:sz w:val="20"/>
+        </w:rPr>
+        <w:t>Marketing (Foundations) — British Higher School of Design (2026)</w:t>
+      </w:r>
+    </w:p>
+    <w:p>
+      <w:pPr>
+        <w:pStyle w:val="ListBullet"/>
+        <w:spacing w:after="40"/>
       </w:pPr>
       <w:r>
         <w:rPr>
           <w:b/>
-          <w:sz w:val="24"/>
+          <w:i w:val="0"/>
+          <w:sz w:val="20"/>
         </w:rPr>
-        <w:t>Обо мне</w:t>
+        <w:t>English:</w:t>
+      </w:r>
+      <w:r>
+        <w:rPr>
+          <w:b w:val="0"/>
+          <w:i w:val="0"/>
+          <w:sz w:val="20"/>
+        </w:rPr>
+        <w:t xml:space="preserve"> B2</w:t>
       </w:r>
     </w:p>
     <w:p>
       <w:pPr>
-        <w:spacing w:before="0" w:after="40"/>
+        <w:spacing w:before="240" w:after="80"/>
+        <w:pBdr>
+          <w:bottom w:val="single" w:sz="4" w:space="1" w:color="1F3A5F"/>
+        </w:pBdr>
+      </w:pPr>
+      <w:r>
+        <w:rPr>
+          <w:b/>
+          <w:i w:val="0"/>
+          <w:color w:val="1F3A5F"/>
+          <w:sz w:val="24"/>
+        </w:rPr>
+        <w:t>Tools &amp; Technologies</w:t>
+      </w:r>
+    </w:p>
+    <w:p>
+      <w:pPr>
+        <w:spacing w:after="40"/>
       </w:pPr>
       <w:r>
         <w:rPr>
           <w:b w:val="0"/>
-          <w:sz w:val="21"/>
+          <w:i w:val="0"/>
+          <w:sz w:val="20"/>
         </w:rPr>
-        <w:t>Senior L&amp;D с 10+ годами опыта в корпоративном обучении, Sales Enablement, Instructional Design и Customer Education. Соединяю L&amp;D, маркетинг и AI, чтобы превращать обучение в измеримый бизнес-результат: рост конверсии и win rate, снижение time-to-productivity, рост NPS. Работаю data-informed: гипотеза -&gt; MVP -&gt; итерации -&gt; метрики. Создаю с нуля программы обучения, матрицы компетенций, role-based треки, онбординг. Опыт в разных отраслях: железная дорога, телеком, банки, EdTech. Планирую релокацию в Минск осенью 2026.</w:t>
+        <w:t>Notion, Miro, Tilda, Canva, Loom, Google Workspace, GenAI (GPT, Claude), Prompt Engineering, Python (LLM pipelines), GitHub, AOS Analyzer</w:t>
       </w:r>
     </w:p>
     <w:p>
       <w:pPr>
-        <w:spacing w:before="0" w:after="40"/>
+        <w:spacing w:before="240" w:after="80"/>
+        <w:pBdr>
+          <w:bottom w:val="single" w:sz="4" w:space="1" w:color="1F3A5F"/>
+        </w:pBdr>
+      </w:pPr>
+      <w:r>
+        <w:rPr>
+          <w:b/>
+          <w:i w:val="0"/>
+          <w:color w:val="1F3A5F"/>
+          <w:sz w:val="24"/>
+        </w:rPr>
+        <w:t>Languages</w:t>
+      </w:r>
+    </w:p>
+    <w:p>
+      <w:pPr>
+        <w:spacing w:after="40"/>
       </w:pPr>
       <w:r>
         <w:rPr>
           <w:b w:val="0"/>
-          <w:sz w:val="21"/>
+          <w:i w:val="0"/>
+          <w:sz w:val="20"/>
         </w:rPr>
+        <w:t>Russian (native), English (B2)</w:t>
       </w:r>
     </w:p>
     <w:p>
       <w:pPr>
-        <w:spacing w:before="0" w:after="40"/>
+        <w:spacing w:before="240" w:after="80"/>
+        <w:pBdr>
+          <w:bottom w:val="single" w:sz="4" w:space="1" w:color="1F3A5F"/>
+        </w:pBdr>
       </w:pPr>
       <w:r>
         <w:rPr>
           <w:b/>
+          <w:i w:val="0"/>
+          <w:color w:val="1F3A5F"/>
           <w:sz w:val="24"/>
         </w:rPr>
-        <w:t>Ключевые навыки</w:t>
+        <w:t>Preferences</w:t>
       </w:r>
     </w:p>
     <w:p>
       <w:pPr>
-        <w:spacing w:before="0" w:after="40"/>
-      </w:pPr>
-      <w:r>
-        <w:rPr>
-          <w:b w:val="0"/>
-          <w:sz w:val="21"/>
-        </w:rPr>
-        <w:t>Enablement и онбординг: Sales Enablement, Marketing Enablement, Онбординг, Customer Education, Playbooks/Job Aids, Time-to-Productivity, Adoption, Win Rate</w:t>
-      </w:r>
-    </w:p>
-    <w:p>
-      <w:pPr>
-        <w:spacing w:before="0" w:after="40"/>
-      </w:pPr>
-      <w:r>
-        <w:rPr>
-          <w:b w:val="0"/>
-          <w:sz w:val="21"/>
-        </w:rPr>
-        <w:t>Instructional Design: Instructional Design, Microlearning, Content Strategy, Blended Learning, E-learning, Программы ДПО, ToT, Андрагогика</w:t>
-      </w:r>
-    </w:p>
-    <w:p>
-      <w:pPr>
-        <w:spacing w:before="0" w:after="40"/>
-      </w:pPr>
-      <w:r>
-        <w:rPr>
-          <w:b w:val="0"/>
-          <w:sz w:val="21"/>
-        </w:rPr>
-        <w:t>Аналитика и оценка: Learning Analytics, Матрица компетенций, Skills Gap Analysis, Role-based треки, Аттестация персонала, Kirkpatrick, NPS, A/B-тесты, Когортный анализ</w:t>
-      </w:r>
-    </w:p>
-    <w:p>
-      <w:pPr>
-        <w:spacing w:before="0" w:after="40"/>
-      </w:pPr>
-      <w:r>
-        <w:rPr>
-          <w:b w:val="0"/>
-          <w:sz w:val="21"/>
-        </w:rPr>
-        <w:t>LMS и Learning Operations: Управление LMS-операциями (постановка задач на SCORM-контент, контроль качества, приёмка подрядчиков), Content QA, бюджетирование обучения</w:t>
-      </w:r>
-    </w:p>
-    <w:p>
-      <w:pPr>
-        <w:spacing w:before="0" w:after="40"/>
-      </w:pPr>
-      <w:r>
-        <w:rPr>
-          <w:b w:val="0"/>
-          <w:sz w:val="21"/>
-        </w:rPr>
-        <w:t>GenAI и автоматизация: GenAI для контента, Prompting, Workflow Automation, Data-informed дизайн</w:t>
-      </w:r>
-    </w:p>
-    <w:p>
-      <w:pPr>
-        <w:spacing w:before="0" w:after="40"/>
-      </w:pPr>
-      <w:r>
-        <w:rPr>
-          <w:b w:val="0"/>
-          <w:sz w:val="21"/>
-        </w:rPr>
-        <w:t>Управление: Stakeholder Management, Vendor Management, Управление командой, Бюджетирование обучения</w:t>
-      </w:r>
-    </w:p>
-    <w:p>
-      <w:pPr>
-        <w:spacing w:before="0" w:after="40"/>
-      </w:pPr>
-      <w:r>
-        <w:rPr>
-          <w:b w:val="0"/>
-          <w:sz w:val="21"/>
-        </w:rPr>
-        <w:t>Инструменты: Notion, Miro, Tilda, Canva, Loom, Google Suite, Course Editor</w:t>
-      </w:r>
-    </w:p>
-    <w:p>
-      <w:pPr>
-        <w:spacing w:before="0" w:after="40"/>
-      </w:pPr>
-      <w:r>
-        <w:rPr>
-          <w:b w:val="0"/>
-          <w:sz w:val="21"/>
-        </w:rPr>
-      </w:r>
-    </w:p>
-    <w:p>
-      <w:pPr>
-        <w:spacing w:before="0" w:after="40"/>
+        <w:spacing w:after="40"/>
       </w:pPr>
       <w:r>
         <w:rPr>
           <w:b/>
-          <w:sz w:val="24"/>
+          <w:i w:val="0"/>
+          <w:sz w:val="20"/>
         </w:rPr>
-        <w:t>Опыт работы</w:t>
+        <w:t>Location:</w:t>
       </w:r>
-    </w:p>
-    <w:p>
-      <w:pPr>
-        <w:spacing w:before="0" w:after="40"/>
-      </w:pPr>
       <w:r>
         <w:rPr>
           <w:b w:val="0"/>
-          <w:sz w:val="21"/>
+          <w:i w:val="0"/>
+          <w:sz w:val="20"/>
         </w:rPr>
-      </w:r>
-    </w:p>
-    <w:p>
-      <w:pPr>
-        <w:spacing w:before="0" w:after="40"/>
-      </w:pPr>
-      <w:r>
-        <w:rPr>
-          <w:b/>
-          <w:sz w:val="21"/>
-        </w:rPr>
-        <w:t>Ведущий методист / Менеджер образовательных проектов</w:t>
-      </w:r>
-    </w:p>
-    <w:p>
-      <w:pPr>
-        <w:spacing w:before="0" w:after="40"/>
-      </w:pPr>
-      <w:r>
-        <w:rPr>
-          <w:b w:val="0"/>
-          <w:sz w:val="21"/>
-        </w:rPr>
-        <w:t>Корпоративный университет ОАО «РЖД» — февраль 2024 — настоящее время</w:t>
-      </w:r>
-    </w:p>
-    <w:p>
-      <w:pPr>
-        <w:spacing w:before="0" w:after="40"/>
-      </w:pPr>
-      <w:r>
-        <w:rPr>
-          <w:b w:val="0"/>
-          <w:sz w:val="21"/>
-        </w:rPr>
-        <w:t>- Запустила программу развития для руководителей путевого комплекса (50+ регионов): матрица компетенций, microlearning, blended learning, выездные стажировки, ToT</w:t>
-      </w:r>
-    </w:p>
-    <w:p>
-      <w:pPr>
-        <w:spacing w:before="0" w:after="40"/>
-      </w:pPr>
-      <w:r>
-        <w:rPr>
-          <w:b w:val="0"/>
-          <w:sz w:val="21"/>
-        </w:rPr>
-        <w:t>- Полный цикл: discovery, дизайн контента, работа с преподавателями, QA, оценка эффективности</w:t>
-      </w:r>
-    </w:p>
-    <w:p>
-      <w:pPr>
-        <w:spacing w:before="0" w:after="40"/>
-      </w:pPr>
-      <w:r>
-        <w:rPr>
-          <w:b w:val="0"/>
-          <w:sz w:val="21"/>
-        </w:rPr>
-        <w:t>- Управление LMS-операциями: постановка задач на SCORM-курсы, контроль качества, приёмка подрядчиков, аналитика прогресса и adoption</w:t>
-      </w:r>
-    </w:p>
-    <w:p>
-      <w:pPr>
-        <w:spacing w:before="0" w:after="40"/>
-      </w:pPr>
-      <w:r>
-        <w:rPr>
-          <w:b w:val="0"/>
-          <w:sz w:val="21"/>
-        </w:rPr>
-        <w:t>- Организация аттестации персонала: дизайн процедуры, матрица компетенций, аналитика результатов</w:t>
-      </w:r>
-    </w:p>
-    <w:p>
-      <w:pPr>
-        <w:spacing w:before="0" w:after="40"/>
-      </w:pPr>
-      <w:r>
-        <w:rPr>
-          <w:b w:val="0"/>
-          <w:sz w:val="21"/>
-        </w:rPr>
-        <w:t>- Результат: 400+ обученных (2024-2025); NPS 9.7 (март 2026); премия «Смарт Пирамида — 2024» за лучший образовательный продукт</w:t>
-      </w:r>
-    </w:p>
-    <w:p>
-      <w:pPr>
-        <w:spacing w:before="0" w:after="40"/>
-      </w:pPr>
-      <w:r>
-        <w:rPr>
-          <w:b w:val="0"/>
-          <w:sz w:val="21"/>
-        </w:rPr>
-        <w:t>- Внедрила AI-аналитику анкет обратной связи (AOS): автоматическая обработка 100+ анкет за цикл, A/B-тесты, генерация отчётов</w:t>
-      </w:r>
-    </w:p>
-    <w:p>
-      <w:pPr>
-        <w:spacing w:before="0" w:after="40"/>
-      </w:pPr>
-      <w:r>
-        <w:rPr>
-          <w:b w:val="0"/>
-          <w:sz w:val="21"/>
-        </w:rPr>
-        <w:t>- Участие в планировании бюджета обучения и отчётности по программам</w:t>
-      </w:r>
-    </w:p>
-    <w:p>
-      <w:pPr>
-        <w:spacing w:before="0" w:after="40"/>
-      </w:pPr>
-      <w:r>
-        <w:rPr>
-          <w:b w:val="0"/>
-          <w:sz w:val="21"/>
-        </w:rPr>
-      </w:r>
-    </w:p>
-    <w:p>
-      <w:pPr>
-        <w:spacing w:before="0" w:after="40"/>
-      </w:pPr>
-      <w:r>
-        <w:rPr>
-          <w:b/>
-          <w:sz w:val="21"/>
-        </w:rPr>
-        <w:t>Менеджер образовательных проектов</w:t>
-      </w:r>
-    </w:p>
-    <w:p>
-      <w:pPr>
-        <w:spacing w:before="0" w:after="40"/>
-      </w:pPr>
-      <w:r>
-        <w:rPr>
-          <w:b w:val="0"/>
-          <w:sz w:val="21"/>
-        </w:rPr>
-        <w:t>МГТУ им. Н.Э. Баумана — май 2023 — февраль 2024</w:t>
-      </w:r>
-    </w:p>
-    <w:p>
-      <w:pPr>
-        <w:spacing w:before="0" w:after="40"/>
-      </w:pPr>
-      <w:r>
-        <w:rPr>
-          <w:b w:val="0"/>
-          <w:sz w:val="21"/>
-        </w:rPr>
-        <w:t>- Разработала программы ДПО для внешних заказчиков с нуля: discovery, curriculum design, e-learning, очные форматы</w:t>
-      </w:r>
-    </w:p>
-    <w:p>
-      <w:pPr>
-        <w:spacing w:before="0" w:after="40"/>
-      </w:pPr>
-      <w:r>
-        <w:rPr>
-          <w:b w:val="0"/>
-          <w:sz w:val="21"/>
-        </w:rPr>
-        <w:t>- Внедрила role-based треки, методподдержку преподавателей, цикл обновления контента по обратной связи</w:t>
-      </w:r>
-    </w:p>
-    <w:p>
-      <w:pPr>
-        <w:spacing w:before="0" w:after="40"/>
-      </w:pPr>
-      <w:r>
-        <w:rPr>
-          <w:b w:val="0"/>
-          <w:sz w:val="21"/>
-        </w:rPr>
-        <w:t>- Управление загрузкой контента в LMS и аналитика результатов обучения</w:t>
-      </w:r>
-    </w:p>
-    <w:p>
-      <w:pPr>
-        <w:spacing w:before="0" w:after="40"/>
-      </w:pPr>
-      <w:r>
-        <w:rPr>
-          <w:b w:val="0"/>
-          <w:sz w:val="21"/>
-        </w:rPr>
-      </w:r>
-    </w:p>
-    <w:p>
-      <w:pPr>
-        <w:spacing w:before="0" w:after="40"/>
-      </w:pPr>
-      <w:r>
-        <w:rPr>
-          <w:b/>
-          <w:sz w:val="21"/>
-        </w:rPr>
-        <w:t>Менеджер образовательных программ (СберБизнес)</w:t>
-      </w:r>
-    </w:p>
-    <w:p>
-      <w:pPr>
-        <w:spacing w:before="0" w:after="40"/>
-      </w:pPr>
-      <w:r>
-        <w:rPr>
-          <w:b w:val="0"/>
-          <w:sz w:val="21"/>
-        </w:rPr>
-        <w:t>Сбер — апрель 2021 — ноябрь 2021</w:t>
-      </w:r>
-    </w:p>
-    <w:p>
-      <w:pPr>
-        <w:spacing w:before="0" w:after="40"/>
-      </w:pPr>
-      <w:r>
-        <w:rPr>
-          <w:b w:val="0"/>
-          <w:sz w:val="21"/>
-        </w:rPr>
-        <w:t>- Портфель обучения для 9 000+ сотрудников коммерческого блока: диагностика потребностей, архитектура решений, работа с вендором</w:t>
-      </w:r>
-    </w:p>
-    <w:p>
-      <w:pPr>
-        <w:spacing w:before="0" w:after="40"/>
-      </w:pPr>
-      <w:r>
-        <w:rPr>
-          <w:b w:val="0"/>
-          <w:sz w:val="21"/>
-        </w:rPr>
-        <w:t>- Перезапуск онбординга: модульная программа + job aids, role-based треки</w:t>
-      </w:r>
-    </w:p>
-    <w:p>
-      <w:pPr>
-        <w:spacing w:before="0" w:after="40"/>
-      </w:pPr>
-      <w:r>
-        <w:rPr>
-          <w:b w:val="0"/>
-          <w:sz w:val="21"/>
-        </w:rPr>
-        <w:t>- Управление LMS-операциями: контроль загрузки, аналитика adoption (когорты 30/60/90)</w:t>
-      </w:r>
-    </w:p>
-    <w:p>
-      <w:pPr>
-        <w:spacing w:before="0" w:after="40"/>
-      </w:pPr>
-      <w:r>
-        <w:rPr>
-          <w:b w:val="0"/>
-          <w:sz w:val="21"/>
-        </w:rPr>
-        <w:t>- Результат: -30% time-to-productivity; adoption инструментов до 85%</w:t>
-      </w:r>
-    </w:p>
-    <w:p>
-      <w:pPr>
-        <w:spacing w:before="0" w:after="40"/>
-      </w:pPr>
-      <w:r>
-        <w:rPr>
-          <w:b w:val="0"/>
-          <w:sz w:val="21"/>
-        </w:rPr>
-        <w:t>- Управление командой (4 чел.) и подрядчиками</w:t>
-      </w:r>
-    </w:p>
-    <w:p>
-      <w:pPr>
-        <w:spacing w:before="0" w:after="40"/>
-      </w:pPr>
-      <w:r>
-        <w:rPr>
-          <w:b w:val="0"/>
-          <w:sz w:val="21"/>
-        </w:rPr>
-      </w:r>
-    </w:p>
-    <w:p>
-      <w:pPr>
-        <w:spacing w:before="0" w:after="40"/>
-      </w:pPr>
-      <w:r>
-        <w:rPr>
-          <w:b/>
-          <w:sz w:val="21"/>
-        </w:rPr>
-        <w:t>Дополнительный опыт</w:t>
-      </w:r>
-    </w:p>
-    <w:p>
-      <w:pPr>
-        <w:spacing w:before="0" w:after="40"/>
-      </w:pPr>
-      <w:r>
-        <w:rPr>
-          <w:b w:val="0"/>
-          <w:sz w:val="21"/>
-        </w:rPr>
-        <w:t>ФРИИ (2021) — программа внутренних инноваций (100+ ак.ч., онлайн) для фарм-дистрибьютора (12 000+ сотр.)</w:t>
-      </w:r>
-    </w:p>
-    <w:p>
-      <w:pPr>
-        <w:spacing w:before="0" w:after="40"/>
-      </w:pPr>
-      <w:r>
-        <w:rPr>
-          <w:b w:val="0"/>
-          <w:sz w:val="21"/>
-        </w:rPr>
-        <w:t>ГБУ «Малый бизнес Москвы» (2020-2021) — 4 отраслевых акселератора, образовательная платформа</w:t>
-      </w:r>
-    </w:p>
-    <w:p>
-      <w:pPr>
-        <w:spacing w:before="0" w:after="40"/>
-      </w:pPr>
-      <w:r>
-        <w:rPr>
-          <w:b w:val="0"/>
-          <w:sz w:val="21"/>
-        </w:rPr>
-        <w:t>CRMM (2020) — разработка e-learning курсов для ПАО «Сбербанк»</w:t>
-      </w:r>
-    </w:p>
-    <w:p>
-      <w:pPr>
-        <w:spacing w:before="0" w:after="40"/>
-      </w:pPr>
-      <w:r>
-        <w:rPr>
-          <w:b w:val="0"/>
-          <w:sz w:val="21"/>
-        </w:rPr>
-        <w:t>Moscow Business School (2012-2014) — управление портфелем открытых программ, подготовка преподавателей</w:t>
-      </w:r>
-    </w:p>
-    <w:p>
-      <w:pPr>
-        <w:spacing w:before="0" w:after="40"/>
-      </w:pPr>
-      <w:r>
-        <w:rPr>
-          <w:b w:val="0"/>
-          <w:sz w:val="21"/>
-        </w:rPr>
-      </w:r>
-    </w:p>
-    <w:p>
-      <w:pPr>
-        <w:spacing w:before="0" w:after="40"/>
-      </w:pPr>
-      <w:r>
-        <w:rPr>
-          <w:b/>
-          <w:sz w:val="24"/>
-        </w:rPr>
-        <w:t>Образование</w:t>
-      </w:r>
-    </w:p>
-    <w:p>
-      <w:pPr>
-        <w:spacing w:before="0" w:after="40"/>
-      </w:pPr>
-      <w:r>
-        <w:rPr>
-          <w:b w:val="0"/>
-          <w:sz w:val="21"/>
-        </w:rPr>
-        <w:t>Московский городской педагогический университет</w:t>
-      </w:r>
-    </w:p>
-    <w:p>
-      <w:pPr>
-        <w:spacing w:before="0" w:after="40"/>
-      </w:pPr>
-      <w:r>
-        <w:rPr>
-          <w:b w:val="0"/>
-          <w:sz w:val="21"/>
-        </w:rPr>
-        <w:t>Психология; Педагогика и психология образования</w:t>
-      </w:r>
-    </w:p>
-    <w:p>
-      <w:pPr>
-        <w:spacing w:before="0" w:after="40"/>
-      </w:pPr>
-      <w:r>
-        <w:rPr>
-          <w:b w:val="0"/>
-          <w:sz w:val="21"/>
-        </w:rPr>
-      </w:r>
-    </w:p>
-    <w:p>
-      <w:pPr>
-        <w:spacing w:before="0" w:after="40"/>
-      </w:pPr>
-      <w:r>
-        <w:rPr>
-          <w:b w:val="0"/>
-          <w:sz w:val="21"/>
-        </w:rPr>
-        <w:t>Повышение квалификации:</w:t>
-      </w:r>
-    </w:p>
-    <w:p>
-      <w:pPr>
-        <w:spacing w:before="0" w:after="40"/>
-      </w:pPr>
-      <w:r>
-        <w:rPr>
-          <w:b w:val="0"/>
-          <w:sz w:val="21"/>
-        </w:rPr>
-        <w:t>- Маркетинг. Базовый курс — БВШД (2026)</w:t>
-      </w:r>
-    </w:p>
-    <w:p>
-      <w:pPr>
-        <w:spacing w:before="0" w:after="40"/>
-      </w:pPr>
-      <w:r>
-        <w:rPr>
-          <w:b w:val="0"/>
-          <w:sz w:val="21"/>
-        </w:rPr>
-        <w:t>- Интенсив по проектированию обучения — Университет ИТМО (2023)</w:t>
-      </w:r>
-    </w:p>
-    <w:p>
-      <w:pPr>
-        <w:spacing w:before="0" w:after="40"/>
-      </w:pPr>
-      <w:r>
-        <w:rPr>
-          <w:b w:val="0"/>
-          <w:sz w:val="21"/>
-        </w:rPr>
-        <w:t>- Внутренний маркетинг и коммуникации — НИУ ВШЭ (2022)</w:t>
-      </w:r>
-    </w:p>
-    <w:p>
-      <w:pPr>
-        <w:spacing w:before="0" w:after="40"/>
-      </w:pPr>
-      <w:r>
-        <w:rPr>
-          <w:b w:val="0"/>
-          <w:sz w:val="21"/>
-        </w:rPr>
-      </w:r>
-    </w:p>
-    <w:p>
-      <w:pPr>
-        <w:spacing w:before="0" w:after="40"/>
-      </w:pPr>
-      <w:r>
-        <w:rPr>
-          <w:b w:val="0"/>
-          <w:sz w:val="21"/>
-        </w:rPr>
-        <w:t>Языки:</w:t>
-      </w:r>
-    </w:p>
-    <w:p>
-      <w:pPr>
-        <w:spacing w:before="0" w:after="40"/>
-      </w:pPr>
-      <w:r>
-        <w:rPr>
-          <w:b w:val="0"/>
-          <w:sz w:val="21"/>
-        </w:rPr>
-        <w:t>- Русский (родной)</w:t>
-      </w:r>
-    </w:p>
-    <w:p>
-      <w:pPr>
-        <w:spacing w:before="0" w:after="40"/>
-      </w:pPr>
-      <w:r>
-        <w:rPr>
-          <w:b w:val="0"/>
-          <w:sz w:val="21"/>
-        </w:rPr>
-        <w:t>- Английский — B2</w:t>
+        <w:t xml:space="preserve"> Minsk (relocating Q4 2026) • Format: office/hybrid/remote • Open to projects and consulting</w:t>
       </w:r>
     </w:p>
     <w:sectPr>
@@ -1132,13 +1146,6 @@
     <w:name w:val="Normal"/>
     <w:qFormat/>
     <w:rsid w:val="00FC693F"/>
-    <w:pPr>
-      <w:spacing w:before="0" w:after="0"/>
-    </w:pPr>
-    <w:rPr>
-      <w:rFonts w:ascii="Calibri" w:hAnsi="Calibri"/>
-      <w:sz w:val="21"/>
-    </w:rPr>
   </w:style>
   <w:style w:type="paragraph" w:styleId="Header">
     <w:name w:val="header"/>

</xml_diff>